<commit_message>
Update CV file reference in Navigation and Skills sections; enhance CV description with additional programming languages
</commit_message>
<xml_diff>
--- a/Israel_Karibo_Alalibo_CV_BNY_FullStack.docx
+++ b/Israel_Karibo_Alalibo_CV_BNY_FullStack.docx
@@ -112,7 +112,13 @@
         <w:spacing w:after="200"/>
       </w:pPr>
       <w:r>
-        <w:t xml:space="preserve">Full Stack Engineer with commercial C# .NET experience building enterprise applications in high-volume, high-availability environments. </w:t>
+        <w:t>Full Stack Engineer with commercial C# .NET</w:t>
+      </w:r>
+      <w:r>
+        <w:t>, Java, PHP, Python</w:t>
+      </w:r>
+      <w:r>
+        <w:t xml:space="preserve"> experience building enterprise applications in high-volume, high-availability environments. </w:t>
       </w:r>
       <w:proofErr w:type="gramStart"/>
       <w:r>
@@ -128,15 +134,7 @@
       </w:r>
       <w:proofErr w:type="gramEnd"/>
       <w:r>
-        <w:t xml:space="preserve"> systems that process thousands of transactions daily for major retailers. Strong focus on code quality, SOLID principles, and clean architecture. Experience with TDD practices, Continuous Integration via Azure DevOps, and automated deployment pipelines. </w:t>
-      </w:r>
-      <w:proofErr w:type="gramStart"/>
-      <w:r>
-        <w:t>Comfortable</w:t>
-      </w:r>
-      <w:proofErr w:type="gramEnd"/>
-      <w:r>
-        <w:t xml:space="preserve"> conducting code reviews, creating technical documentation, and collaborating in Agile/Scrum teams. Passionate about continuous improvement and helping teams deliver better software. Also built an automated trading system in Python demonstrating ability to work across the full stack and deliver complex, reliable solutions in financial contexts.</w:t>
+        <w:t xml:space="preserve"> systems that process thousands of transactions daily for major retailers. Strong focus on code quality, SOLID principles, and clean architecture. Experience with TDD practices, Continuous Integration via Azure DevOps, and automated deployment pipelines. Comfortable conducting code reviews, creating technical documentation, and collaborating in Agile/Scrum teams. Passionate about continuous improvement and helping teams deliver better software. Also built an automated trading system in Python demonstrating ability to work across the full stack and deliver complex, reliable solutions in financial contexts.</w:t>
       </w:r>
     </w:p>
     <w:p>

</xml_diff>